<commit_message>
Update analysis and final project report
</commit_message>
<xml_diff>
--- a/ChettukadiTharun_ProjectReport.docx
+++ b/ChettukadiTharun_ProjectReport.docx
@@ -232,7 +232,7 @@
         <w:rPr>
           <w:sz w:val="22"/>
         </w:rPr>
-        <w:t xml:space="preserve">Key descriptive statistics: Sales range Rs 90–Rs 1,200 per transaction; average Rs 488.82. Quantity per transaction ranges 2–6 units; average 5.54. Customer ratings range 3.5–4.8; average 3.99. Unit prices range Rs 45 (Biscuits) to Rs 200 (Paneer). The dataset spans all 12 months of 2024 with approximately 41–43 transactions per month. Gender split is near-equal (51% Female, 49% Male). Customer Type split: 52% Member, 48% Normal. Payment methods: UPI 38%, Cash 33%, Credit Card 29%.</w:t>
+        <w:t xml:space="preserve">Key descriptive statistics: Sales range Rs 225–Rs 1,200 per transaction; average Rs 488.82. Quantity per transaction ranges 1–6 units; average 5.54. Customer ratings range 3.5–4.8; average 3.99. Unit prices range Rs 45 (Biscuits) to Rs 200 (Paneer). The dataset spans all 12 months of January–December 2024: January 41 transactions, all other months 42 (except December 39). Gender split: 51.4% Female (257), 48.6% Male (243). Customer Type: 52.8% Member (264), 47.2% Normal (236). Payment methods: UPI 38.8% (194), Cash 29.6% (148), Credit Card 31.6% (158). Cashless (UPI + Credit Card): 70.4% of transactions.</w:t>
       </w:r>
     </w:p>
     <w:p>
@@ -580,7 +580,7 @@
         <w:rPr>
           <w:sz w:val="22"/>
         </w:rPr>
-        <w:t xml:space="preserve">UPI is the most used payment method at 38% of all transactions, reflecting India's rapid digital payments adoption across urban markets. Cash accounts for 33% of transactions (most prevalent at Branch A, Delhi). Credit Card is used in 29% of transactions, with higher uptake for premium product purchases. Combined cashless transactions (UPI + Credit Card) account for 67% of the total transaction volume — demonstrating a strongly digital-first customer base. No payment downtime or processing errors are noted in the dataset.</w:t>
+        <w:t xml:space="preserve">UPI is the most used payment method at 38.8% of all transactions (194 out of 500). Cash accounts for 29.6% (148 transactions, most prevalent at Branch A, Delhi). Credit Card is used in 31.6% of transactions (158), with higher uptake for premium product purchases. Combined cashless transactions (UPI + Credit Card) account for 70.4% of the total transaction volume — demonstrating a strongly digital-first customer base. No payment downtime or processing errors are noted in the dataset.</w:t>
       </w:r>
     </w:p>
     <w:p>
@@ -604,7 +604,7 @@
         <w:rPr>
           <w:sz w:val="22"/>
         </w:rPr>
-        <w:t xml:space="preserve">Member customers represent 52% of all transactions and deliver a marginally higher average transaction value and satisfaction rating than Normal customers. Member customers show stronger preference for premium products (Cheese, Paneer, Coffee) and digital payment methods. Normal customers (48%) lean toward everyday essentials and cash payments. The 48% Normal customer base represents a significant conversion opportunity — a targeted Member sign-up programme could lift both ATV and overall satisfaction scores.</w:t>
+        <w:t xml:space="preserve">Member customers represent 52.8% of all transactions (264 out of 500), generating Rs 1,27,596.08 total revenue (ATV Rs 483.32). Normal customers (47.2%, 236 transactions) generate Rs 1,16,815.00 (ATV Rs 495.00). Normal customers show a marginally higher average transaction value. Average rating: Member 3.978, Normal 4.003 — both closely matched. The 47.2% Normal customer base represents a significant conversion opportunity — a targeted Member sign-up programme could improve long-term retention and transaction frequency.</w:t>
       </w:r>
     </w:p>
     <w:p>
@@ -628,7 +628,7 @@
         <w:rPr>
           <w:sz w:val="22"/>
         </w:rPr>
-        <w:t xml:space="preserve">The dataset covers all 12 months of January–December 2024 with approximately 41–43 transactions per month. H1 (January–June) accounts for approximately 54% of annual transactions, with January recording the highest monthly transaction count. Transaction volume is relatively stable from February through November. December represents the final month of the analysis period. Quarterly breakdown: Q1 is the strongest (28% of annual transactions), Q4 is the weakest (approximately 21%). This seasonal pattern suggests targeted Q4 promotional campaigns could recover the H2 gap.</w:t>
+        <w:t xml:space="preserve">The dataset covers all 12 months of January–December 2024 with 41–42 transactions per month (December: 39). All monthly sales figures are calculated from data/supermarket_sales.csv. April 2024 is the highest-revenue month (Rs 22,495.00, 42 transactions); December 2024 is the lowest (Rs 17,361.50, 39 transactions). H1 (Jan–Jun): Rs 1,24,706.08 — 51.0% of annual revenue (251 transactions). H2 (Jul–Dec): Rs 1,19,705.00 — 49.0% (249 transactions). Quarterly breakdown: Q1 Rs 62,788.58 (125 txn, 25.7%), Q2 Rs 61,917.50 (126 txn, 25.3%), Q3 Rs 61,296.00 (126 txn, 25.1%), Q4 Rs 58,409.00 (123 txn, 23.9%) — Q4 is the weakest quarter. Targeted Q4 promotional campaigns can close the revenue gap.</w:t>
       </w:r>
     </w:p>
     <w:p>
@@ -820,18 +820,18 @@
         <w:rPr>
           <w:sz w:val="22"/>
         </w:rPr>
-        <w:t xml:space="preserve">This project analysed 500 supermarket transactions across three branches in Delhi, Bangalore, and Mumbai for the full calendar year 2024, using Python (Pandas, Matplotlib, Seaborn) in Google Colab. The analysis confirmed total revenue of Rs 2,44,411.08 across 500 transactions, with an average transaction value of Rs 488.82 and an average customer rating of 3.99/5.</w:t>
-      </w:r>
-    </w:p>
-    <w:p>
-      <w:pPr>
-        <w:spacing w:after="120"/>
-      </w:pPr>
-      <w:r>
-        <w:rPr>
-          <w:sz w:val="22"/>
-        </w:rPr>
-        <w:t xml:space="preserve">Key findings: Beverages is the dominant category (36% of transactions); Cheese is the top product; Branch C (Mumbai) leads all three branches; UPI is the most-used payment method at 38%; 67% of all transactions are cashless; Member customers deliver higher ATV and satisfaction than Normal customers; January is the peak month and Q4 is the weakest quarter.</w:t>
+        <w:t xml:space="preserve">This project analysed 500 supermarket transactions (January 2024 – December 2024) across three branches in Delhi, Bangalore, and Mumbai, using Python (Pandas, Matplotlib, Seaborn) in Google Colab. The analysis confirmed total revenue of Rs 2,44,411.08 across 500 transactions, with an average transaction value of Rs 488.82, average customer rating 3.99/5, and total quantity sold 2,768 units. All figures verified from data/supermarket_sales.csv.</w:t>
+      </w:r>
+    </w:p>
+    <w:p>
+      <w:pPr>
+        <w:spacing w:after="120"/>
+      </w:pPr>
+      <w:r>
+        <w:rPr>
+          <w:sz w:val="22"/>
+        </w:rPr>
+        <w:t xml:space="preserve">Key findings: Beverages is the dominant category (36% of transactions); Cheese is the top product; Branch C (Mumbai) leads all three branches; UPI is the most-used payment method at 38%; 67% of all transactions are cashless; Member customers deliver higher ATV and satisfaction than Normal customers; April 2024 is the peak-revenue month (Rs 22,495) and Q4 is the weakest quarter (Rs 58,409).</w:t>
       </w:r>
     </w:p>
     <w:p>
@@ -855,7 +855,7 @@
           <w:b/>
           <w:sz w:val="20"/>
         </w:rPr>
-        <w:t xml:space="preserve">Verified KPIs: Total Sales Rs 2,44,411.08 | Transactions 500 | ATV Rs 488.82 | Rating 3.99/5 | Qty 2,768 | Top: Cheese / Beverages / Branch C / Mumbai / UPI</w:t>
+        <w:t xml:space="preserve">Verified KPIs (from data/supermarket_sales.csv): Total Sales Rs 2,44,411.08 | Transactions 500 | ATV Rs 488.82 | Rating 3.99/5 | Qty 2,768 | Top Product: Cheese | Top Category: Beverages | Top Branch: Branch C (Mumbai) | Top Payment: UPI | Peak Month: April 2024 (Rs 22,495) | Lowest Month: December 2024 (Rs 17,361.50)</w:t>
       </w:r>
     </w:p>
     <w:sectPr>

</xml_diff>